<commit_message>
docs: correct BT2 source attribution and strengthen validation plan
</commit_message>
<xml_diff>
--- a/tai-lieu/cd-phong/tuan-1/bt2-vong-tay-mau-co-san/BT2_CD_PHONG_Co_hoi_kinh_doanh_vong_tay_mau_co_san.docx
+++ b/tai-lieu/cd-phong/tuan-1/bt2-vong-tay-mau-co-san/BT2_CD_PHONG_Co_hoi_kinh_doanh_vong_tay_mau_co_san.docx
@@ -14,7 +14,7 @@
     </w:p>
     <w:p>
       <w:r>
-        <w:t>Người biên soạn: Phong – Communication &amp; Documentation Lead | 19/10/2026</w:t>
+        <w:t>Người biên soạn: Phong – Communication &amp; Documentation Lead | 20/10/2026</w:t>
       </w:r>
     </w:p>
     <w:p>
@@ -32,32 +32,32 @@
     </w:p>
     <w:p>
       <w:r>
-        <w:t>Nhóm xác định cơ hội thử nghiệm kinh doanh vòng tay mẫu có sẵn cho sinh viên tại TP.HCM. Theo tài liệu đề xuất của nhóm, khảo sát ngày 18–19/10/2026 có 28 phản hồi; 27 người là sinh viên và 26 người thuộc nhóm 18–22 tuổi. Đây là căn cứ ban đầu để xác định khách hàng, chưa đại diện toàn thị trường.</w:t>
+        <w:t>Nhóm chọn thử nghiệm kinh doanh vòng tay mẫu có sẵn, ưu tiên sinh viên tại TP.HCM. Theo tài liệu nhóm, khảo sát ngày 18–19/10/2026 ghi nhận 28 phản hồi: 27 người là sinh viên, 26 người thuộc nhóm 18–22 tuổi. Đây là thông tin của mẫu khảo sát, chưa đại diện thị trường.</w:t>
       </w:r>
     </w:p>
     <w:p>
       <w:r>
-        <w:t>Trong mẫu khảo sát, 19/28 người thích kiểu đơn giản, 26/28 quan tâm chất liệu, 21/28 quan tâm giá và 10/28 ngần ngại vì chưa tìm được mẫu phù hợp. Nhu cầu cần giải quyết là chọn vòng hợp sở thích, có thông tin rõ ràng và vừa tay, để đeo hằng ngày hoặc làm quà.</w:t>
+        <w:t>Trong mẫu, 19/28 người thích kiểu đơn giản, 26/28 quan tâm chất liệu, 21/28 quan tâm giá; 10/28 ngần ngại vì chưa tìm được mẫu phù hợp. Hai mục đích được ghi nhận là mua làm quà và đeo hằng ngày/phối trang phục. Cơ hội cần kiểm chứng là giúp khách chọn vòng hợp sở thích với thông tin sản phẩm rõ ràng.</w:t>
       </w:r>
     </w:p>
     <w:p>
       <w:r>
-        <w:t>Nhóm chọn hướng bán vòng tay mẫu có sẵn, ưu tiên kiểu đơn giản; mã hàng và nhà cung cấp chưa được chốt. Giá trị đề xuất là ảnh sản phẩm thật, thông tin chất liệu và kích thước rõ, kiểm tra dây/khóa trước giao và hỗ trợ lựa chọn theo nhu cầu.</w:t>
+        <w:t>Nhóm đề xuất danh mục vòng có sẵn kiểu đơn giản, ảnh thật, thông tin chất liệu và kích thước có căn cứ, kiểm tra dây/khóa trước giao. Mã hàng, nhà cung cấp và giá bán chưa chốt; giá trị này chưa được chứng minh vượt đối thủ.</w:t>
       </w:r>
     </w:p>
     <w:p>
       <w:r>
-        <w:t>Nhóm dự kiến tiếp cận qua mạng lưới sinh viên, Facebook/Instagram và giới thiệu trực tiếp; có thể dùng nội dung TikTok để khách xem cách đeo. Kênh bán cần được thử, không mặc định kênh được ưa thích sẽ tạo đơn.</w:t>
+        <w:t>Cách tiếp cận đề xuất là giới thiệu mẫu trực tiếp qua mạng lưới sinh viên, dùng tin nhắn và mạng xã hội hỗ trợ tư vấn. Kênh giao dịch sẽ được kiểm tra theo lựa chọn và hành động mua; kênh ưu tiên trong khảo sát chưa phải lịch sử mua.</w:t>
       </w:r>
     </w:p>
     <w:p>
       <w:r>
-        <w:t>Các số liệu hiện được trích từ bản tổng hợp của nhóm, chưa đối soát phản hồi gốc. Tuần 2, nhóm dự kiến cho 5–10 khách mục tiêu xem mẫu và mức giá có căn cứ, ghi lựa chọn, lý do từ chối và hành động đặt mua thực tế để kiểm chứng nhu cầu.</w:t>
+        <w:t>Số liệu hiện được trích từ bản tổng hợp, chưa đối soát phản hồi gốc. Tuần 2, nhóm dự kiến hỏi 5–10 khách về lần mua gần nhất, rồi cho xem mẫu và giá đã xác nhận để ghi lựa chọn, lý do từ chối, ý định và đơn mua nếu phát sinh.</w:t>
       </w:r>
     </w:p>
     <w:p>
       <w:r>
-        <w:t>Độ dài phần mô tả: 269 từ theo khoảng trắng. Nguồn: MC-00, MC-01. Đây là phần 200–300 từ theo yêu cầu; các mục còn lại là phân tích và phụ lục.</w:t>
+        <w:t>Độ dài phần mô tả: 270 từ theo khoảng trắng. Nguồn: MC-00, MC-01. Đây là phần 200–300 từ theo yêu cầu; các mục còn lại là phân tích và phụ lục.</w:t>
       </w:r>
     </w:p>
     <w:p>
@@ -180,7 +180,7 @@
               <w:rPr>
                 <w:sz w:val="17"/>
               </w:rPr>
-              <w:t>Ưu tiên sinh viên 18–22 tuổi trong mạng lưới nhóm tại TP.HCM.</w:t>
+              <w:t>Nhóm ưu tiên tiếp cận sinh viên 18–22 tuổi tại TP.HCM như một lựa chọn triển khai.</w:t>
             </w:r>
           </w:p>
         </w:tc>
@@ -196,7 +196,7 @@
               <w:rPr>
                 <w:sz w:val="17"/>
               </w:rPr>
-              <w:t>27/28 là sinh viên; 26/28 thuộc nhóm 18–22 tuổi [MC-01]. TP.HCM là địa bàn nhóm đã cung cấp, chưa biết địa bàn từng phản hồi.</w:t>
+              <w:t>27/28 là sinh viên và 26/28 thuộc nhóm 18–22 tuổi là hai số liệu riêng [MC-01]; chưa biết giao nhau giữa hai nhóm hoặc địa bàn từng phản hồi.</w:t>
             </w:r>
           </w:p>
         </w:tc>
@@ -235,7 +235,7 @@
               <w:rPr>
                 <w:sz w:val="17"/>
               </w:rPr>
-              <w:t>Cần món quà hợp sở thích, dễ lựa chọn và vừa tay người nhận.</w:t>
+              <w:t>Mục đích mua quà có trong báo cáo; giả thuyết cần hỏi thêm là nhu cầu chọn mẫu phù hợp người nhận và kích thước.</w:t>
             </w:r>
           </w:p>
         </w:tc>
@@ -252,7 +252,7 @@
               <w:rPr>
                 <w:sz w:val="17"/>
               </w:rPr>
-              <w:t>14/28 chọn mục đích làm quà; 9/14 thích kiểu đơn giản [MC-01]. Nhu cầu cụ thể cần kiểm với mẫu thật.</w:t>
+              <w:t>14/28 chọn mục đích làm quà; 9/14 thích kiểu đơn giản [MC-01, mục 2.1, dòng Sở thích]. Chưa xác nhận họ sẽ mua mẫu nhóm chọn.</w:t>
             </w:r>
           </w:p>
         </w:tc>
@@ -289,7 +289,7 @@
               <w:rPr>
                 <w:sz w:val="17"/>
               </w:rPr>
-              <w:t>Cần phụ kiện đơn giản, dễ phối; muốn biết chất liệu và kích thước.</w:t>
+              <w:t>Mục đích đeo/phối trang phục có trong báo cáo; cách hỗ trợ chọn cỡ và thông tin chất liệu cần được thử với khách.</w:t>
             </w:r>
           </w:p>
         </w:tc>
@@ -305,7 +305,7 @@
               <w:rPr>
                 <w:sz w:val="17"/>
               </w:rPr>
-              <w:t>12/28 chọn mục đích đeo hằng ngày/phối trang phục; 8/12 thích kiểu đơn giản [MC-01].</w:t>
+              <w:t>12/28 chọn đeo hằng ngày/phối trang phục; 8/12 thích kiểu đơn giản [MC-01, mục 2.1, dòng Sở thích].</w:t>
             </w:r>
           </w:p>
         </w:tc>
@@ -453,7 +453,7 @@
     </w:p>
     <w:p>
       <w:r>
-        <w:t>Nhóm ưu tiên sinh viên 18–22 tuổi trong mạng lưới tại TP.HCM, với hai mục đích nổi bật trong mẫu: mua làm quà và mua để đeo hằng ngày/phối trang phục. Căn cứ là số liệu Huy tổng hợp: 27/28 người trả lời là sinh viên, 26/28 thuộc nhóm 18–22 tuổi; 14/28 chọn mua làm quà, 12/28 chọn đeo hằng ngày [MC-01]. Đây là nhóm có nhu cầu được tự khai, chưa phải danh sách khách chắc chắn sẽ mua.</w:t>
+        <w:t>Nhóm ưu tiên tiếp cận sinh viên 18–22 tuổi trong mạng lưới tại TP.HCM, với hai mục đích: mua làm quà hoặc đeo/phối trang phục. Báo cáo Huy ghi 27/28 người trả lời là sinh viên, 26/28 thuộc nhóm 18–22 tuổi; 14/28 chọn mua quà và 12/28 chọn đeo hằng ngày [MC-01]. Đây là định hướng khách hàng dựa trên hai đặc điểm riêng trong mẫu, không phải kết luận mọi người khảo sát đều sống tại TP.HCM hoặc có khả năng mua ngay. Cần kiểm mẫu, giá và thời điểm họ thực sự muốn mua.</w:t>
       </w:r>
     </w:p>
     <w:p>
@@ -466,7 +466,7 @@
     </w:p>
     <w:p>
       <w:r>
-        <w:t>Bằng chứng sơ bộ là khảo sát 28 phản hồi ngày 18–19/10/2026, được nhóm dẫn trong tài liệu: 19/28 thích kiểu đơn giản, 26/28 quan tâm chất liệu và 10/28 còn ngần ngại vì chưa tìm được mẫu phù hợp [MC-01]. Các chỉ số hỗ trợ hướng chọn mẫu và thông tin cần cung cấp. Giới hạn: mẫu nhỏ, chủ yếu sinh viên; chưa có dữ liệu gốc để kiểm cách chọn mẫu, tính duy nhất và cấu trúc câu hỏi; sở thích/ý định không tương đương đơn mua. Chưa có phản hồi trực tiếp với các mã V1–V5.</w:t>
+        <w:t>Bằng chứng hiện có là bản tổng hợp 28 phản hồi ngày 18–19/10/2026: 19/28 thích kiểu đơn giản, 26/28 quan tâm chất liệu và 10/28 chưa tìm được mẫu phù hợp [MC-01]. Các con số hỗ trợ chọn hướng thử nghiệm, chưa chứng minh nhu cầu với mã vòng cụ thể. Mẫu nhỏ và chủ yếu sinh viên; chưa đối soát cách chọn mẫu, câu hỏi và phản hồi trùng. Hai mục đích mua chưa chắc loại trừ nhau. Các mã MC-01–MC-04 đều được truy qua tài liệu nhóm MC-00, chưa phải các nguồn độc lập đã kiểm tra. Ý định trong 3 tháng cũng không đồng nghĩa mua ở tuần 2.</w:t>
       </w:r>
     </w:p>
     <w:p>
@@ -479,7 +479,7 @@
     </w:p>
     <w:p>
       <w:r>
-        <w:t>Bản tổng hợp chưa cho biết lịch sử mua thực tế. Nó ghi kênh ưu tiên: nhóm mua quà chọn Shopee 5/14, trực tiếp 4/14, TikTok Shop 3/14; nhóm đeo hằng ngày chọn trực tiếp 7/12, Shopee 4/12, Facebook/Instagram 1/12 [MC-01]. Sản phẩm tương tự được nhóm ghi nhận ở Pinky Shop: mô tả 30.000đ/chiếc, 50.000đ/bộ 2 nhưng ô giá hiển thị 50.000đ còn cần làm rõ [MC-02]. Tại Imoon Jewelry VN, bảng của nhóm ghi 170.000–199.000đ tùy mẫu [MC-03]; chất liệu/phân khúc chưa tương đồng nên không so giá ngang. Đây là thông tin niêm yết nhóm trích, chưa phải giá khách đã trả.</w:t>
+        <w:t>Chưa đủ dữ liệu để khẳng định khách đã mua ở đâu và trả bao nhiêu. Báo cáo chỉ ghi kênh ưu tiên: người mua quà chọn Shopee 5/14, người mua để đeo chọn trực tiếp 7/12; các kênh còn lại ở phụ lục [MC-01]. Tài liệu ghi giá 30.000đ/chiếc và 50.000đ/bộ 2 dưới tên “Pinky Shop”, nhưng dẫn cả quatanglambangtay.com và pinky.vn: chưa xác định giá thuộc URL/cấu hình nào [MC-02]. Mức 170.000–199.000đ của các mẫu Imoon chỉ được ghi qua ShopeeAnalytics [MC-03], khác phân khúc dự kiến của nhóm. Cần ảnh giá theo đúng mẫu và câu trả lời về lần mua thật để hoàn tất đối chiếu.</w:t>
       </w:r>
     </w:p>
     <w:p>
@@ -492,7 +492,7 @@
     </w:p>
     <w:p>
       <w:r>
-        <w:t>Giá trị nhóm dự kiến cung cấp là danh mục mẫu có sẵn dễ chọn, ảnh thật, thông tin chất liệu/kích thước rõ, kiểm tra dây/khóa trước giao và hỗ trợ chọn theo mục đích sử dụng. Nội dung này bám các ưu tiên về chất liệu, giá, độ bền và kiểu đơn giản trong khảo sát [MC-01]. Nhóm chưa có bằng chứng làm tốt hơn đối thủ hoặc khách chấp nhận giá bán dự kiến; các điểm trên là đề xuất giá trị cần thử với khách, không phải lợi thế đã được chứng minh.</w:t>
+        <w:t>Lý do chọn nhóm được đề xuất là giảm khó khăn khi chọn mẫu: danh mục đơn giản, ảnh thật, thông tin chất liệu/cỡ có căn cứ, giá và điều kiện nhận hàng rõ, kiểm tra dây/khóa trước giao. Đề xuất bám ưu tiên về kiểu dáng, chất liệu, giá và độ bền [MC-01]. Chỉ công bố thông tin đã xác nhận; kiểm ngoại quan không chứng minh thành phần hay độ bền dài hạn. Khi thử, hỏi khách vì sao chọn nhóm hoặc cửa hàng khác ở cùng điều kiện. Chưa có bằng chứng để khẳng định rẻ hơn, bền hơn hay được chọn nhiều hơn đối thủ.</w:t>
       </w:r>
     </w:p>
     <w:p>
@@ -505,7 +505,7 @@
     </w:p>
     <w:p>
       <w:r>
-        <w:t>Trước hết, Bằng và Hưng xác nhận mẫu, chất liệu, giá đơn nhỏ, tồn hàng và phí giao; chưa nhập nếu chưa giải quyết được điều kiện giá sỉ [MC-04]. Huy và Nam dự kiến mời 5–10 khách mục tiêu xem cùng mẫu và mức giá có căn cứ, ghi lựa chọn, lý do từ chối, mức giá chấp nhận và ý định mua; Danh hỗ trợ ảnh/nội dung. Nếu có đặt mua, Nam lưu trạng thái đơn thật, tách khỏi lượt thích/hỏi giá. Phong tổng hợp chứng cứ, Đạt kiểm và Nghĩa quyết định giữ/đổi mẫu hoặc tiếp tục thử. Đây là kế hoạch đề xuất, chưa phải hoạt động đã diễn ra.</w:t>
+        <w:t>Đề xuất tuần 2: Bằng/Hưng xác nhận mẫu và báo giá ở lượng mua phù hợp ngân sách; Huy/Nam hỏi 5–10 khách về lần mua gần nhất và ngân sách trước khi cho xem mẫu, sau đó ghi lựa chọn, lý do, mức giá và hành động mua. Danh chuẩn bị hình/nội dung có nguồn. Nam/Hưng tách đơn thật và trạng thái xử lý; Phong tổng hợp, Đạt đối chiếu, Nghĩa quyết định giữ mẫu, sửa hoặc thử tiếp. Phần 4 có câu hỏi và tiêu chí quyết định định tính, chưa đặt số đơn hoặc tỷ lệ đạt khi nhóm chưa chốt. Đây là kế hoạch, chưa phải kết quả.</w:t>
       </w:r>
     </w:p>
     <w:p>
@@ -617,7 +617,7 @@
               <w:rPr>
                 <w:sz w:val="17"/>
               </w:rPr>
-              <w:t>Xác nhận nguồn hàng trước test</w:t>
+              <w:t>Xác nhận nguồn hàng trước thử bán</w:t>
               <w:br/>
               <w:t>Bằng, Hưng</w:t>
             </w:r>
@@ -635,7 +635,7 @@
               <w:rPr>
                 <w:sz w:val="17"/>
               </w:rPr>
-              <w:t>Chốt thông tin mẫu có thể mua, chất liệu, cỡ, giá ở lượng mua thực, tồn hàng và phí giao. Nếu dùng ảnh shop phải ghi rõ nguồn, chưa gọi là ảnh mẫu của nhóm.</w:t>
+              <w:t>Chốt mẫu, thông tin chất liệu/cỡ có căn cứ, giá đơn nhỏ, tồn hàng, vận chuyển và điều kiện lỗi/đổi. Kiểm tra điều kiện sỉ thay vì coi giá tham khảo là báo giá.</w:t>
             </w:r>
           </w:p>
         </w:tc>
@@ -651,9 +651,9 @@
               <w:rPr>
                 <w:sz w:val="17"/>
               </w:rPr>
-              <w:t>Báo giá/trao đổi có ngày; ảnh có nguồn; cấu hình và điều kiện mua được shop xác nhận.</w:t>
+              <w:t>Báo giá/trao đổi có ngày, mẫu và lượng mua; phân biệt ảnh shop với ảnh do nhóm chụp.</w:t>
               <w:br/>
-              <w:t>Chưa có báo giá đơn nhỏ hoặc mẫu cuối được xác nhận trong đầu vào.</w:t>
+              <w:t>Chưa được cung cấp báo giá đơn nhỏ hoặc mẫu cuối được xác nhận.</w:t>
             </w:r>
           </w:p>
         </w:tc>
@@ -675,7 +675,7 @@
               <w:rPr>
                 <w:sz w:val="17"/>
               </w:rPr>
-              <w:t>Cho khách xem mẫu và hỏi nhu cầu</w:t>
+              <w:t>Hỏi trải nghiệm trước khi cho xem giá</w:t>
               <w:br/>
               <w:t>Huy, Nam</w:t>
             </w:r>
@@ -694,7 +694,7 @@
               <w:rPr>
                 <w:sz w:val="17"/>
               </w:rPr>
-              <w:t>Tiếp cận 5–10 khách tiềm năng theo gợi ý của đề; hỏi mục đích, lựa chọn mẫu, cỡ/chất liệu quan tâm, mức giá chấp nhận và lý do từ chối. Ghi rõ người từng tham gia khảo sát cũ nếu khảo sát lại.</w:t>
+              <w:t>Đề xuất 5–10 khách theo gợi ý của đề. Hỏi lần mua vòng gần nhất, nơi mua, số tiền/đơn vị, mục đích, trở ngại và ngân sách trước khi đưa mẫu/giá để hạn chế dẫn dắt.</w:t>
             </w:r>
           </w:p>
         </w:tc>
@@ -711,9 +711,9 @@
               <w:rPr>
                 <w:sz w:val="17"/>
               </w:rPr>
-              <w:t>Phiếu theo mã người tham gia, thời điểm, mẫu/giá đã xem, câu trả lời; xin phép ghi nhận.</w:t>
+              <w:t>Mã người, ngày, cách tuyển, lần đầu/khảo sát lại, câu trả lời nguyên ý; cho phép chưa từng mua/không nhớ.</w:t>
               <w:br/>
-              <w:t>Cỡ mẫu này là kế hoạch kiểm chứng, không phải phản hồi đã thu.</w:t>
+              <w:t>Chưa có phản hồi tuần 2 được cung cấp; không điền thay khách.</w:t>
             </w:r>
           </w:p>
         </w:tc>
@@ -734,7 +734,7 @@
               <w:rPr>
                 <w:sz w:val="17"/>
               </w:rPr>
-              <w:t>Kiểm tra đề xuất giá trị</w:t>
+              <w:t>Cho xem cùng bộ thông tin và so sánh</w:t>
               <w:br/>
               <w:t>Danh, Nam; Huy tổng hợp</w:t>
             </w:r>
@@ -752,7 +752,7 @@
               <w:rPr>
                 <w:sz w:val="17"/>
               </w:rPr>
-              <w:t>Cho khách xem ảnh/thông tin cụ thể và phương án tương tự; hỏi lý do chọn nhóm hoặc chọn nơi khác, không gợi ý câu trả lời.</w:t>
+              <w:t>Công bố đúng mẫu, nguồn ảnh, chất liệu/cỡ đã xác nhận, giá và phí nhận hàng. Hỏi chọn mẫu nào hoặc không chọn, vì sao, chọn nhóm hay nơi khác.</w:t>
             </w:r>
           </w:p>
         </w:tc>
@@ -768,9 +768,9 @@
               <w:rPr>
                 <w:sz w:val="17"/>
               </w:rPr>
-              <w:t>Ghi nguyên ý kiến về mẫu, chất liệu, giá, cách nhận; nguồn và giá đối thủ cùng thời điểm/cấu hình khi có.</w:t>
+              <w:t>Lưu phiên bản ảnh/mẫu, giá đã xem và lý do; nếu đổi mẫu/giá thì ghi riêng để tránh gộp kết quả khác điều kiện.</w:t>
               <w:br/>
-              <w:t>Không ghi nhóm vượt trội nếu chỉ là nhận xét nội bộ.</w:t>
+              <w:t>Có thể hỏi sở thích bằng ảnh shop ghi nguồn; chỉ nhận đơn khi có khả năng thực hiện.</w:t>
             </w:r>
           </w:p>
         </w:tc>
@@ -811,7 +811,7 @@
               <w:rPr>
                 <w:sz w:val="17"/>
               </w:rPr>
-              <w:t>Chỉ công bố điều kiện có thể thực hiện; ghi riêng hỏi giá, quan tâm, xác nhận đặt, cọc, giao, hủy. Không thu cọc khi nhóm chưa thống nhất khả năng thực hiện và điều kiện giao dịch.</w:t>
+              <w:t>Ghi riêng quan tâm, xác nhận đặt, cọc, giao, hủy; gắn mã đơn và thời điểm. Không mặc định thu cọc hoặc đã mở shop sàn khi nhóm chưa thống nhất.</w:t>
             </w:r>
           </w:p>
         </w:tc>
@@ -828,9 +828,9 @@
               <w:rPr>
                 <w:sz w:val="17"/>
               </w:rPr>
-              <w:t>Mã đơn, mẫu/giá, thời điểm, trạng thái và chứng từ nếu phát sinh; ẩn thông tin riêng ở bản nộp.</w:t>
+              <w:t>Bảng đơn thật; số chiếc, giá, phí và chứng từ khi phát sinh; không đếm một khách hỏi nhiều lần thành nhiều khách.</w:t>
               <w:br/>
-              <w:t>Chưa có số đơn, tỷ lệ chuyển đổi hoặc doanh thu để báo cáo.</w:t>
+              <w:t>Phân biệt số người, số đơn và số chiếc; chưa có số thực để báo cáo.</w:t>
             </w:r>
           </w:p>
         </w:tc>
@@ -869,7 +869,7 @@
               <w:rPr>
                 <w:sz w:val="17"/>
               </w:rPr>
-              <w:t>Đối chiếu lựa chọn, lý do từ chối, mức giá, nguồn hàng và hành động mua. Giữ mẫu, sửa đề xuất hoặc thử tiếp dựa trên dữ liệu thu được.</w:t>
+              <w:t>Đối chiếu nhu cầu, mức giá, khả năng cung ứng và hành động thực. Phân loại giữ mẫu để thử tiếp, cần sửa hoặc chưa đủ căn cứ theo tiêu chí ở dưới.</w:t>
             </w:r>
           </w:p>
         </w:tc>
@@ -885,9 +885,9 @@
               <w:rPr>
                 <w:sz w:val="17"/>
               </w:rPr>
-              <w:t>Bảng kết quả thực; minh chứng nguồn; biên bản quyết định có người/ngày xác nhận.</w:t>
+              <w:t>Bảng kết quả có nguồn, phản hồi từ chối; quyết định ghi người/ngày và lý do.</w:t>
               <w:br/>
-              <w:t>Chưa tự đặt ngưỡng đạt, chỉ tiêu doanh số hoặc lịch ngày khi nhóm chưa chốt.</w:t>
+              <w:t>Các đầu mối/tiêu chí này là đề xuất, cần nhóm xác nhận trước triển khai.</w:t>
             </w:r>
           </w:p>
         </w:tc>
@@ -908,8 +908,586 @@
     </w:p>
     <w:p>
       <w:r>
-        <w:t>Mã người tham gia; ngày; đối tượng; lần đầu/khảo sát lại; mẫu và ảnh đã xem; nguồn ảnh; giá/điều kiện đã thông báo; lựa chọn; mức giá chấp nhận; lý do chọn/từ chối; trạng thái hành động mua; ghi chú đồng ý lưu phản hồi. Chưa điền số người, câu trả lời hoặc kết quả giả.</w:t>
+        <w:t>Dùng phiếu khách và bảng đơn hàng riêng trong Excel. Mỗi người có mã; mã đơn liên kết với mã khách, tách số người, số đơn và số chiếc. Giá lịch sử ghi rõ đơn vị chiếc/bộ và là tự khai hay có chứng từ. Lưu phiên bản mẫu/giá đã xem; chưa có dữ liệu thì để trống, không tự điền 0.</w:t>
       </w:r>
+    </w:p>
+    <w:p>
+      <w:r>
+        <w:br w:type="page"/>
+      </w:r>
+    </w:p>
+    <w:p>
+      <w:pPr>
+        <w:pStyle w:val="Heading2"/>
+      </w:pPr>
+      <w:r>
+        <w:t>Câu hỏi và tiêu chí quyết định cho tuần 2</w:t>
+      </w:r>
+    </w:p>
+    <w:tbl>
+      <w:tblPr>
+        <w:tblStyle w:val="TableGrid"/>
+        <w:tblW w:type="auto" w:w="0"/>
+        <w:tblLayout w:type="fixed"/>
+        <w:tblLook w:firstColumn="1" w:firstRow="1" w:lastColumn="0" w:lastRow="0" w:noHBand="0" w:noVBand="1" w:val="04A0"/>
+      </w:tblPr>
+      <w:tblGrid>
+        <w:gridCol w:w="1871"/>
+        <w:gridCol w:w="4535"/>
+        <w:gridCol w:w="3628"/>
+      </w:tblGrid>
+      <w:tr>
+        <w:trPr>
+          <w:tblHeader/>
+          <w:cantSplit/>
+        </w:trPr>
+        <w:tc>
+          <w:tcPr>
+            <w:tcW w:type="dxa" w:w="1871"/>
+            <w:shd w:fill="154C5B"/>
+          </w:tcPr>
+          <w:p>
+            <w:pPr>
+              <w:spacing w:after="60" w:line="245" w:lineRule="auto"/>
+            </w:pPr>
+            <w:r>
+              <w:rPr>
+                <w:b/>
+                <w:color w:val="FFFFFF"/>
+                <w:sz w:val="17"/>
+              </w:rPr>
+              <w:t>Thời điểm</w:t>
+            </w:r>
+          </w:p>
+        </w:tc>
+        <w:tc>
+          <w:tcPr>
+            <w:tcW w:type="dxa" w:w="4535"/>
+            <w:shd w:fill="154C5B"/>
+          </w:tcPr>
+          <w:p>
+            <w:pPr>
+              <w:spacing w:after="60" w:line="245" w:lineRule="auto"/>
+            </w:pPr>
+            <w:r>
+              <w:rPr>
+                <w:b/>
+                <w:color w:val="FFFFFF"/>
+                <w:sz w:val="17"/>
+              </w:rPr>
+              <w:t>Câu hỏi đề xuất</w:t>
+            </w:r>
+          </w:p>
+        </w:tc>
+        <w:tc>
+          <w:tcPr>
+            <w:tcW w:type="dxa" w:w="3628"/>
+            <w:shd w:fill="154C5B"/>
+          </w:tcPr>
+          <w:p>
+            <w:pPr>
+              <w:spacing w:after="60" w:line="245" w:lineRule="auto"/>
+            </w:pPr>
+            <w:r>
+              <w:rPr>
+                <w:b/>
+                <w:color w:val="FFFFFF"/>
+                <w:sz w:val="17"/>
+              </w:rPr>
+              <w:t>Cách ghi nhận</w:t>
+            </w:r>
+          </w:p>
+        </w:tc>
+      </w:tr>
+      <w:tr>
+        <w:trPr>
+          <w:cantSplit/>
+        </w:trPr>
+        <w:tc>
+          <w:tcPr>
+            <w:tcW w:type="dxa" w:w="1871"/>
+          </w:tcPr>
+          <w:p>
+            <w:pPr>
+              <w:spacing w:after="60" w:line="245" w:lineRule="auto"/>
+            </w:pPr>
+            <w:r>
+              <w:rPr>
+                <w:sz w:val="17"/>
+              </w:rPr>
+              <w:t>Trước khi xem mẫu/giá</w:t>
+            </w:r>
+          </w:p>
+        </w:tc>
+        <w:tc>
+          <w:tcPr>
+            <w:tcW w:type="dxa" w:w="4535"/>
+          </w:tcPr>
+          <w:p>
+            <w:pPr>
+              <w:spacing w:after="60" w:line="245" w:lineRule="auto"/>
+            </w:pPr>
+            <w:r>
+              <w:rPr>
+                <w:sz w:val="17"/>
+              </w:rPr>
+              <w:t>Bạn đã từng mua vòng tay chưa? Lần gần nhất khi nào, ở đâu, trả bao nhiêu cho một chiếc/bộ?</w:t>
+            </w:r>
+          </w:p>
+        </w:tc>
+        <w:tc>
+          <w:tcPr>
+            <w:tcW w:type="dxa" w:w="3628"/>
+          </w:tcPr>
+          <w:p>
+            <w:pPr>
+              <w:spacing w:after="60" w:line="245" w:lineRule="auto"/>
+            </w:pPr>
+            <w:r>
+              <w:rPr>
+                <w:sz w:val="17"/>
+              </w:rPr>
+              <w:t>Cho phép chưa từng mua/không nhớ; ghi rõ đơn vị và giá tự khai, không bắt buộc chứng từ.</w:t>
+            </w:r>
+          </w:p>
+        </w:tc>
+      </w:tr>
+      <w:tr>
+        <w:trPr>
+          <w:cantSplit/>
+        </w:trPr>
+        <w:tc>
+          <w:tcPr>
+            <w:tcW w:type="dxa" w:w="1871"/>
+            <w:shd w:fill="EFF5F4"/>
+          </w:tcPr>
+          <w:p>
+            <w:pPr>
+              <w:spacing w:after="60" w:line="245" w:lineRule="auto"/>
+            </w:pPr>
+            <w:r>
+              <w:rPr>
+                <w:sz w:val="17"/>
+              </w:rPr>
+              <w:t>Trước khi xem mẫu/giá</w:t>
+            </w:r>
+          </w:p>
+        </w:tc>
+        <w:tc>
+          <w:tcPr>
+            <w:tcW w:type="dxa" w:w="4535"/>
+            <w:shd w:fill="EFF5F4"/>
+          </w:tcPr>
+          <w:p>
+            <w:pPr>
+              <w:spacing w:after="60" w:line="245" w:lineRule="auto"/>
+            </w:pPr>
+            <w:r>
+              <w:rPr>
+                <w:sz w:val="17"/>
+              </w:rPr>
+              <w:t>Bạn mua để làm gì? Điều gì khiến bạn chọn hoặc bỏ mua? Ngân sách cho lần mua tới khoảng bao nhiêu?</w:t>
+            </w:r>
+          </w:p>
+        </w:tc>
+        <w:tc>
+          <w:tcPr>
+            <w:tcW w:type="dxa" w:w="3628"/>
+            <w:shd w:fill="EFF5F4"/>
+          </w:tcPr>
+          <w:p>
+            <w:pPr>
+              <w:spacing w:after="60" w:line="245" w:lineRule="auto"/>
+            </w:pPr>
+            <w:r>
+              <w:rPr>
+                <w:sz w:val="17"/>
+              </w:rPr>
+              <w:t>Ghi nguyên ý kiến; không gợi ý rằng vòng rẻ, bền hoặc đẹp.</w:t>
+            </w:r>
+          </w:p>
+        </w:tc>
+      </w:tr>
+      <w:tr>
+        <w:trPr>
+          <w:cantSplit/>
+        </w:trPr>
+        <w:tc>
+          <w:tcPr>
+            <w:tcW w:type="dxa" w:w="1871"/>
+          </w:tcPr>
+          <w:p>
+            <w:pPr>
+              <w:spacing w:after="60" w:line="245" w:lineRule="auto"/>
+            </w:pPr>
+            <w:r>
+              <w:rPr>
+                <w:sz w:val="17"/>
+              </w:rPr>
+              <w:t>Sau khi xem bộ thông tin</w:t>
+            </w:r>
+          </w:p>
+        </w:tc>
+        <w:tc>
+          <w:tcPr>
+            <w:tcW w:type="dxa" w:w="4535"/>
+          </w:tcPr>
+          <w:p>
+            <w:pPr>
+              <w:spacing w:after="60" w:line="245" w:lineRule="auto"/>
+            </w:pPr>
+            <w:r>
+              <w:rPr>
+                <w:sz w:val="17"/>
+              </w:rPr>
+              <w:t>Với mẫu, chất liệu/cỡ, giá và phí này, bạn chọn mẫu nào hoặc không chọn? Vì sao?</w:t>
+            </w:r>
+          </w:p>
+        </w:tc>
+        <w:tc>
+          <w:tcPr>
+            <w:tcW w:type="dxa" w:w="3628"/>
+          </w:tcPr>
+          <w:p>
+            <w:pPr>
+              <w:spacing w:after="60" w:line="245" w:lineRule="auto"/>
+            </w:pPr>
+            <w:r>
+              <w:rPr>
+                <w:sz w:val="17"/>
+              </w:rPr>
+              <w:t>Lưu đúng phiên bản đã xem; không loại phản hồi không muốn mua.</w:t>
+            </w:r>
+          </w:p>
+        </w:tc>
+      </w:tr>
+      <w:tr>
+        <w:trPr>
+          <w:cantSplit/>
+        </w:trPr>
+        <w:tc>
+          <w:tcPr>
+            <w:tcW w:type="dxa" w:w="1871"/>
+            <w:shd w:fill="EFF5F4"/>
+          </w:tcPr>
+          <w:p>
+            <w:pPr>
+              <w:spacing w:after="60" w:line="245" w:lineRule="auto"/>
+            </w:pPr>
+            <w:r>
+              <w:rPr>
+                <w:sz w:val="17"/>
+              </w:rPr>
+              <w:t>Sau khi xem bộ thông tin</w:t>
+            </w:r>
+          </w:p>
+        </w:tc>
+        <w:tc>
+          <w:tcPr>
+            <w:tcW w:type="dxa" w:w="4535"/>
+            <w:shd w:fill="EFF5F4"/>
+          </w:tcPr>
+          <w:p>
+            <w:pPr>
+              <w:spacing w:after="60" w:line="245" w:lineRule="auto"/>
+            </w:pPr>
+            <w:r>
+              <w:rPr>
+                <w:sz w:val="17"/>
+              </w:rPr>
+              <w:t>Bạn sẽ chọn nhóm hay nơi khác? Điểm nào ảnh hưởng quyết định và điều gì cần thay đổi?</w:t>
+            </w:r>
+          </w:p>
+        </w:tc>
+        <w:tc>
+          <w:tcPr>
+            <w:tcW w:type="dxa" w:w="3628"/>
+            <w:shd w:fill="EFF5F4"/>
+          </w:tcPr>
+          <w:p>
+            <w:pPr>
+              <w:spacing w:after="60" w:line="245" w:lineRule="auto"/>
+            </w:pPr>
+            <w:r>
+              <w:rPr>
+                <w:sz w:val="17"/>
+              </w:rPr>
+              <w:t>Phân biệt giá trị khách cảm nhận với nhận xét nội bộ của nhóm.</w:t>
+            </w:r>
+          </w:p>
+        </w:tc>
+      </w:tr>
+      <w:tr>
+        <w:trPr>
+          <w:cantSplit/>
+        </w:trPr>
+        <w:tc>
+          <w:tcPr>
+            <w:tcW w:type="dxa" w:w="1871"/>
+          </w:tcPr>
+          <w:p>
+            <w:pPr>
+              <w:spacing w:after="60" w:line="245" w:lineRule="auto"/>
+            </w:pPr>
+            <w:r>
+              <w:rPr>
+                <w:sz w:val="17"/>
+              </w:rPr>
+              <w:t>Khi nói về hành động</w:t>
+            </w:r>
+          </w:p>
+        </w:tc>
+        <w:tc>
+          <w:tcPr>
+            <w:tcW w:type="dxa" w:w="4535"/>
+          </w:tcPr>
+          <w:p>
+            <w:pPr>
+              <w:spacing w:after="60" w:line="245" w:lineRule="auto"/>
+            </w:pPr>
+            <w:r>
+              <w:rPr>
+                <w:sz w:val="17"/>
+              </w:rPr>
+              <w:t>Bạn có muốn đặt ở điều kiện đã thông báo không? Nếu có, thời điểm phù hợp là khi nào?</w:t>
+            </w:r>
+          </w:p>
+        </w:tc>
+        <w:tc>
+          <w:tcPr>
+            <w:tcW w:type="dxa" w:w="3628"/>
+          </w:tcPr>
+          <w:p>
+            <w:pPr>
+              <w:spacing w:after="60" w:line="245" w:lineRule="auto"/>
+            </w:pPr>
+            <w:r>
+              <w:rPr>
+                <w:sz w:val="17"/>
+              </w:rPr>
+              <w:t>Ý định, xác nhận đặt, tiền và giao nhận là các mức khác nhau; chỉ ghi trạng thái đã xảy ra.</w:t>
+            </w:r>
+          </w:p>
+        </w:tc>
+      </w:tr>
+    </w:tbl>
+    <w:p>
+      <w:pPr>
+        <w:spacing w:after="20"/>
+      </w:pPr>
+    </w:p>
+    <w:tbl>
+      <w:tblPr>
+        <w:tblStyle w:val="TableGrid"/>
+        <w:tblW w:type="auto" w:w="0"/>
+        <w:tblLayout w:type="fixed"/>
+        <w:tblLook w:firstColumn="1" w:firstRow="1" w:lastColumn="0" w:lastRow="0" w:noHBand="0" w:noVBand="1" w:val="04A0"/>
+      </w:tblPr>
+      <w:tblGrid>
+        <w:gridCol w:w="3118"/>
+        <w:gridCol w:w="6917"/>
+      </w:tblGrid>
+      <w:tr>
+        <w:trPr>
+          <w:tblHeader/>
+          <w:cantSplit/>
+        </w:trPr>
+        <w:tc>
+          <w:tcPr>
+            <w:tcW w:type="dxa" w:w="3118"/>
+            <w:shd w:fill="154C5B"/>
+          </w:tcPr>
+          <w:p>
+            <w:pPr>
+              <w:spacing w:after="60" w:line="245" w:lineRule="auto"/>
+            </w:pPr>
+            <w:r>
+              <w:rPr>
+                <w:b/>
+                <w:color w:val="FFFFFF"/>
+                <w:sz w:val="17"/>
+              </w:rPr>
+              <w:t>Tình huống</w:t>
+            </w:r>
+          </w:p>
+        </w:tc>
+        <w:tc>
+          <w:tcPr>
+            <w:tcW w:type="dxa" w:w="6917"/>
+            <w:shd w:fill="154C5B"/>
+          </w:tcPr>
+          <w:p>
+            <w:pPr>
+              <w:spacing w:after="60" w:line="245" w:lineRule="auto"/>
+            </w:pPr>
+            <w:r>
+              <w:rPr>
+                <w:b/>
+                <w:color w:val="FFFFFF"/>
+                <w:sz w:val="17"/>
+              </w:rPr>
+              <w:t>Căn cứ / cách xử lý đề xuất</w:t>
+            </w:r>
+          </w:p>
+        </w:tc>
+      </w:tr>
+      <w:tr>
+        <w:trPr>
+          <w:cantSplit/>
+        </w:trPr>
+        <w:tc>
+          <w:tcPr>
+            <w:tcW w:type="dxa" w:w="3118"/>
+          </w:tcPr>
+          <w:p>
+            <w:pPr>
+              <w:spacing w:after="60" w:line="245" w:lineRule="auto"/>
+            </w:pPr>
+            <w:r>
+              <w:rPr>
+                <w:sz w:val="17"/>
+              </w:rPr>
+              <w:t>Có thể thử bán ở quy mô nhóm phê duyệt</w:t>
+            </w:r>
+          </w:p>
+        </w:tc>
+        <w:tc>
+          <w:tcPr>
+            <w:tcW w:type="dxa" w:w="6917"/>
+          </w:tcPr>
+          <w:p>
+            <w:pPr>
+              <w:spacing w:after="60" w:line="245" w:lineRule="auto"/>
+            </w:pPr>
+            <w:r>
+              <w:rPr>
+                <w:sz w:val="17"/>
+              </w:rPr>
+              <w:t>Mẫu/giá/điều kiện mua được xác nhận, phù hợp ngân sách; có cách cung ứng và khách được thông báo đúng điều kiện. Đây là điều kiện triển khai, chưa chứng minh sẽ có lãi.</w:t>
+            </w:r>
+          </w:p>
+        </w:tc>
+      </w:tr>
+      <w:tr>
+        <w:trPr>
+          <w:cantSplit/>
+        </w:trPr>
+        <w:tc>
+          <w:tcPr>
+            <w:tcW w:type="dxa" w:w="3118"/>
+            <w:shd w:fill="EFF5F4"/>
+          </w:tcPr>
+          <w:p>
+            <w:pPr>
+              <w:spacing w:after="60" w:line="245" w:lineRule="auto"/>
+            </w:pPr>
+            <w:r>
+              <w:rPr>
+                <w:sz w:val="17"/>
+              </w:rPr>
+              <w:t>Giữ mẫu để kiểm tra tiếp</w:t>
+            </w:r>
+          </w:p>
+        </w:tc>
+        <w:tc>
+          <w:tcPr>
+            <w:tcW w:type="dxa" w:w="6917"/>
+            <w:shd w:fill="EFF5F4"/>
+          </w:tcPr>
+          <w:p>
+            <w:pPr>
+              <w:spacing w:after="60" w:line="245" w:lineRule="auto"/>
+            </w:pPr>
+            <w:r>
+              <w:rPr>
+                <w:sz w:val="17"/>
+              </w:rPr>
+              <w:t>Phản hồi chỉ ra mẫu/điều kiện phù hợp, có ý định cụ thể hoặc hành động mua được ghi nhận; đối chiếu cả lý do chọn và từ chối, chưa suy rộng thị trường.</w:t>
+            </w:r>
+          </w:p>
+        </w:tc>
+      </w:tr>
+      <w:tr>
+        <w:trPr>
+          <w:cantSplit/>
+        </w:trPr>
+        <w:tc>
+          <w:tcPr>
+            <w:tcW w:type="dxa" w:w="3118"/>
+          </w:tcPr>
+          <w:p>
+            <w:pPr>
+              <w:spacing w:after="60" w:line="245" w:lineRule="auto"/>
+            </w:pPr>
+            <w:r>
+              <w:rPr>
+                <w:sz w:val="17"/>
+              </w:rPr>
+              <w:t>Điều chỉnh hoặc đổi phương án</w:t>
+            </w:r>
+          </w:p>
+        </w:tc>
+        <w:tc>
+          <w:tcPr>
+            <w:tcW w:type="dxa" w:w="6917"/>
+          </w:tcPr>
+          <w:p>
+            <w:pPr>
+              <w:spacing w:after="60" w:line="245" w:lineRule="auto"/>
+            </w:pPr>
+            <w:r>
+              <w:rPr>
+                <w:sz w:val="17"/>
+              </w:rPr>
+              <w:t>Khách không chọn vì mẫu, chất liệu/cỡ, giá/nhận hàng hoặc nguồn không đáp ứng điều kiện; ghi nguyên nhân và chỉ rõ thay đổi sẽ kiểm lại.</w:t>
+            </w:r>
+          </w:p>
+        </w:tc>
+      </w:tr>
+      <w:tr>
+        <w:trPr>
+          <w:cantSplit/>
+        </w:trPr>
+        <w:tc>
+          <w:tcPr>
+            <w:tcW w:type="dxa" w:w="3118"/>
+            <w:shd w:fill="EFF5F4"/>
+          </w:tcPr>
+          <w:p>
+            <w:pPr>
+              <w:spacing w:after="60" w:line="245" w:lineRule="auto"/>
+            </w:pPr>
+            <w:r>
+              <w:rPr>
+                <w:sz w:val="17"/>
+              </w:rPr>
+              <w:t>Chưa đủ căn cứ kết luận</w:t>
+            </w:r>
+          </w:p>
+        </w:tc>
+        <w:tc>
+          <w:tcPr>
+            <w:tcW w:type="dxa" w:w="6917"/>
+            <w:shd w:fill="EFF5F4"/>
+          </w:tcPr>
+          <w:p>
+            <w:pPr>
+              <w:spacing w:after="60" w:line="245" w:lineRule="auto"/>
+            </w:pPr>
+            <w:r>
+              <w:rPr>
+                <w:sz w:val="17"/>
+              </w:rPr>
+              <w:t>Thiếu mẫu/giá xác nhận, chưa có phản hồi thực hoặc chỉ có tương tác mạng xã hội. Tiếp tục thu dữ liệu; không ghi đã thành công hoặc đã thất bại.</w:t>
+            </w:r>
+          </w:p>
+        </w:tc>
+      </w:tr>
+    </w:tbl>
+    <w:p>
+      <w:pPr>
+        <w:spacing w:after="20"/>
+      </w:pPr>
     </w:p>
     <w:p>
       <w:r>
@@ -1895,7 +2473,7 @@
         <w:pStyle w:val="ListBullet"/>
       </w:pPr>
       <w:r>
-        <w:t>Có bằng chứng sơ bộ ở cấp bản tổng hợp nhóm và đường dẫn khảo sát; không ghi là “chưa có bằng chứng”. Tuy nhiên, chưa được đối soát tệp phản hồi gốc nên không khẳng định dữ liệu đã được kiểm toán hoặc đại diện thị trường.</w:t>
+        <w:t>Nguồn trực tiếp đã đọc là MC-00. MC-01–MC-04 là các nhóm thông tin/đường dẫn được MC-00 dẫn lại, chưa phải nhiều nguồn độc lập đã được kiểm tra. Có bằng chứng sơ bộ ở cấp báo cáo nhóm, chưa đối soát phản hồi khảo sát gốc.</w:t>
       </w:r>
     </w:p>
     <w:p>
@@ -1903,7 +2481,7 @@
         <w:pStyle w:val="ListBullet"/>
       </w:pPr>
       <w:r>
-        <w:t>Chưa biết cách chọn mẫu, địa bàn từng phản hồi, cấu trúc câu hỏi và tính duy nhất của người trả lời. Không giả định hai nhóm mục đích mua loại trừ nhau, không cộng tỷ lệ câu hỏi khác nhau thành thị phần.</w:t>
+        <w:t>Chưa biết cách tuyển mẫu, địa bàn, câu hỏi đơn/đa lựa chọn và tính duy nhất của người trả lời. Không suy ra giao nhau giữa nghề nghiệp/độ tuổi; không cộng hai mục đích mua hoặc các kênh thành thị phần.</w:t>
       </w:r>
     </w:p>
     <w:p>
@@ -1911,7 +2489,7 @@
         <w:pStyle w:val="ListBullet"/>
       </w:pPr>
       <w:r>
-        <w:t>Sở thích, mức chi trả tối đa tự khai, kênh ưu tiên và câu trả lời “Có lẽ sẽ mua” đều chưa phải lịch sử mua, cam kết trả tiền hoặc đơn hàng thực.</w:t>
+        <w:t>Các tỷ lệ đã có trong nguồn được tính kiểm từ số đếm; ô tỷ lệ còn trống là nguồn chưa nêu tỷ lệ riêng. Không tự bổ sung tỷ lệ còn thiếu. Ý định trong 3 tháng, kênh ưu tiên và mức chi trả tự khai chưa phải hành vi mua ở tuần 2.</w:t>
       </w:r>
     </w:p>
     <w:p>
@@ -1919,7 +2497,699 @@
         <w:pStyle w:val="ListBullet"/>
       </w:pPr>
       <w:r>
-        <w:t>Không dùng giá nhập/ship/bao bì, phí sàn 10%, doanh thu hoặc lãi giả định trong BT1 làm kết quả thực tế ở BT2. Các báo cáo thị trường và nhận xét hạn chế đối thủ chưa có chứng cứ chi tiết không được dùng làm kết luận chính.</w:t>
+        <w:t>Ba mẫu Imoon thuộc một shop, không phải ba đối thủ độc lập. Giá nguồn khác phân khúc/chất liệu không đủ chứng minh nhóm rẻ hơn. Kịch bản vốn, phí, doanh thu và lãi trong BT1 không phải kết quả bán hàng.</w:t>
+      </w:r>
+    </w:p>
+    <w:p>
+      <w:r>
+        <w:br w:type="page"/>
+      </w:r>
+    </w:p>
+    <w:p>
+      <w:pPr>
+        <w:pStyle w:val="Heading2"/>
+      </w:pPr>
+      <w:r>
+        <w:t>A2. Số liệu chân dung và kênh được dùng trong bài</w:t>
+      </w:r>
+    </w:p>
+    <w:tbl>
+      <w:tblPr>
+        <w:tblStyle w:val="TableGrid"/>
+        <w:tblW w:type="auto" w:w="0"/>
+        <w:tblLayout w:type="fixed"/>
+        <w:tblLook w:firstColumn="1" w:firstRow="1" w:lastColumn="0" w:lastRow="0" w:noHBand="0" w:noVBand="1" w:val="04A0"/>
+      </w:tblPr>
+      <w:tblGrid>
+        <w:gridCol w:w="4592"/>
+        <w:gridCol w:w="1247"/>
+        <w:gridCol w:w="1247"/>
+        <w:gridCol w:w="2948"/>
+      </w:tblGrid>
+      <w:tr>
+        <w:trPr>
+          <w:tblHeader/>
+          <w:cantSplit/>
+        </w:trPr>
+        <w:tc>
+          <w:tcPr>
+            <w:tcW w:type="dxa" w:w="4592"/>
+            <w:shd w:fill="154C5B"/>
+          </w:tcPr>
+          <w:p>
+            <w:pPr>
+              <w:spacing w:after="60" w:line="245" w:lineRule="auto"/>
+            </w:pPr>
+            <w:r>
+              <w:rPr>
+                <w:b/>
+                <w:color w:val="FFFFFF"/>
+                <w:sz w:val="17"/>
+              </w:rPr>
+              <w:t>Chỉ báo</w:t>
+            </w:r>
+          </w:p>
+        </w:tc>
+        <w:tc>
+          <w:tcPr>
+            <w:tcW w:type="dxa" w:w="1247"/>
+            <w:shd w:fill="154C5B"/>
+          </w:tcPr>
+          <w:p>
+            <w:pPr>
+              <w:spacing w:after="60" w:line="245" w:lineRule="auto"/>
+            </w:pPr>
+            <w:r>
+              <w:rPr>
+                <w:b/>
+                <w:color w:val="FFFFFF"/>
+                <w:sz w:val="17"/>
+              </w:rPr>
+              <w:t>Số người / mẫu số</w:t>
+            </w:r>
+          </w:p>
+        </w:tc>
+        <w:tc>
+          <w:tcPr>
+            <w:tcW w:type="dxa" w:w="1247"/>
+            <w:shd w:fill="154C5B"/>
+          </w:tcPr>
+          <w:p>
+            <w:pPr>
+              <w:spacing w:after="60" w:line="245" w:lineRule="auto"/>
+            </w:pPr>
+            <w:r>
+              <w:rPr>
+                <w:b/>
+                <w:color w:val="FFFFFF"/>
+                <w:sz w:val="17"/>
+              </w:rPr>
+              <w:t>Tỷ lệ nguồn nêu</w:t>
+            </w:r>
+          </w:p>
+        </w:tc>
+        <w:tc>
+          <w:tcPr>
+            <w:tcW w:type="dxa" w:w="2948"/>
+            <w:shd w:fill="154C5B"/>
+          </w:tcPr>
+          <w:p>
+            <w:pPr>
+              <w:spacing w:after="60" w:line="245" w:lineRule="auto"/>
+            </w:pPr>
+            <w:r>
+              <w:rPr>
+                <w:b/>
+                <w:color w:val="FFFFFF"/>
+                <w:sz w:val="17"/>
+              </w:rPr>
+              <w:t>Vị trí trong MC-00</w:t>
+            </w:r>
+          </w:p>
+        </w:tc>
+      </w:tr>
+      <w:tr>
+        <w:trPr>
+          <w:cantSplit/>
+        </w:trPr>
+        <w:tc>
+          <w:tcPr>
+            <w:tcW w:type="dxa" w:w="4592"/>
+          </w:tcPr>
+          <w:p>
+            <w:pPr>
+              <w:spacing w:after="60" w:line="245" w:lineRule="auto"/>
+            </w:pPr>
+            <w:r>
+              <w:rPr>
+                <w:sz w:val="17"/>
+              </w:rPr>
+              <w:t>Trong nhóm mua quà: thích kiểu đơn giản</w:t>
+            </w:r>
+          </w:p>
+        </w:tc>
+        <w:tc>
+          <w:tcPr>
+            <w:tcW w:type="dxa" w:w="1247"/>
+          </w:tcPr>
+          <w:p>
+            <w:pPr>
+              <w:spacing w:after="60" w:line="245" w:lineRule="auto"/>
+            </w:pPr>
+            <w:r>
+              <w:rPr>
+                <w:sz w:val="17"/>
+              </w:rPr>
+              <w:t>9/14</w:t>
+            </w:r>
+          </w:p>
+        </w:tc>
+        <w:tc>
+          <w:tcPr>
+            <w:tcW w:type="dxa" w:w="1247"/>
+          </w:tcPr>
+          <w:p>
+            <w:pPr>
+              <w:spacing w:after="60" w:line="245" w:lineRule="auto"/>
+            </w:pPr>
+            <w:r>
+              <w:rPr>
+                <w:sz w:val="17"/>
+              </w:rPr>
+              <w:t>64,3%</w:t>
+            </w:r>
+          </w:p>
+        </w:tc>
+        <w:tc>
+          <w:tcPr>
+            <w:tcW w:type="dxa" w:w="2948"/>
+          </w:tcPr>
+          <w:p>
+            <w:pPr>
+              <w:spacing w:after="60" w:line="245" w:lineRule="auto"/>
+            </w:pPr>
+            <w:r>
+              <w:rPr>
+                <w:sz w:val="17"/>
+              </w:rPr>
+              <w:t>Mục 2.1, bảng chân dung, dòng Sở thích – cột A</w:t>
+            </w:r>
+          </w:p>
+        </w:tc>
+      </w:tr>
+      <w:tr>
+        <w:trPr>
+          <w:cantSplit/>
+        </w:trPr>
+        <w:tc>
+          <w:tcPr>
+            <w:tcW w:type="dxa" w:w="4592"/>
+            <w:shd w:fill="EFF5F4"/>
+          </w:tcPr>
+          <w:p>
+            <w:pPr>
+              <w:spacing w:after="60" w:line="245" w:lineRule="auto"/>
+            </w:pPr>
+            <w:r>
+              <w:rPr>
+                <w:sz w:val="17"/>
+              </w:rPr>
+              <w:t>Trong nhóm đeo hằng ngày: thích kiểu đơn giản</w:t>
+            </w:r>
+          </w:p>
+        </w:tc>
+        <w:tc>
+          <w:tcPr>
+            <w:tcW w:type="dxa" w:w="1247"/>
+            <w:shd w:fill="EFF5F4"/>
+          </w:tcPr>
+          <w:p>
+            <w:pPr>
+              <w:spacing w:after="60" w:line="245" w:lineRule="auto"/>
+            </w:pPr>
+            <w:r>
+              <w:rPr>
+                <w:sz w:val="17"/>
+              </w:rPr>
+              <w:t>8/12</w:t>
+            </w:r>
+          </w:p>
+        </w:tc>
+        <w:tc>
+          <w:tcPr>
+            <w:tcW w:type="dxa" w:w="1247"/>
+            <w:shd w:fill="EFF5F4"/>
+          </w:tcPr>
+          <w:p>
+            <w:pPr>
+              <w:spacing w:after="60" w:line="245" w:lineRule="auto"/>
+            </w:pPr>
+            <w:r>
+              <w:rPr>
+                <w:sz w:val="17"/>
+              </w:rPr>
+              <w:t>66,7%</w:t>
+            </w:r>
+          </w:p>
+        </w:tc>
+        <w:tc>
+          <w:tcPr>
+            <w:tcW w:type="dxa" w:w="2948"/>
+            <w:shd w:fill="EFF5F4"/>
+          </w:tcPr>
+          <w:p>
+            <w:pPr>
+              <w:spacing w:after="60" w:line="245" w:lineRule="auto"/>
+            </w:pPr>
+            <w:r>
+              <w:rPr>
+                <w:sz w:val="17"/>
+              </w:rPr>
+              <w:t>Mục 2.1, bảng chân dung, dòng Sở thích – cột B</w:t>
+            </w:r>
+          </w:p>
+        </w:tc>
+      </w:tr>
+      <w:tr>
+        <w:trPr>
+          <w:cantSplit/>
+        </w:trPr>
+        <w:tc>
+          <w:tcPr>
+            <w:tcW w:type="dxa" w:w="4592"/>
+          </w:tcPr>
+          <w:p>
+            <w:pPr>
+              <w:spacing w:after="60" w:line="245" w:lineRule="auto"/>
+            </w:pPr>
+            <w:r>
+              <w:rPr>
+                <w:sz w:val="17"/>
+              </w:rPr>
+              <w:t>Nhóm mua quà: ưu tiên Shopee</w:t>
+            </w:r>
+          </w:p>
+        </w:tc>
+        <w:tc>
+          <w:tcPr>
+            <w:tcW w:type="dxa" w:w="1247"/>
+          </w:tcPr>
+          <w:p>
+            <w:pPr>
+              <w:spacing w:after="60" w:line="245" w:lineRule="auto"/>
+            </w:pPr>
+            <w:r>
+              <w:rPr>
+                <w:sz w:val="17"/>
+              </w:rPr>
+              <w:t>5/14</w:t>
+            </w:r>
+          </w:p>
+        </w:tc>
+        <w:tc>
+          <w:tcPr>
+            <w:tcW w:type="dxa" w:w="1247"/>
+          </w:tcPr>
+          <w:p>
+            <w:pPr>
+              <w:spacing w:after="60" w:line="245" w:lineRule="auto"/>
+            </w:pPr>
+            <w:r>
+              <w:rPr>
+                <w:sz w:val="17"/>
+              </w:rPr>
+              <w:t>—</w:t>
+            </w:r>
+          </w:p>
+        </w:tc>
+        <w:tc>
+          <w:tcPr>
+            <w:tcW w:type="dxa" w:w="2948"/>
+          </w:tcPr>
+          <w:p>
+            <w:pPr>
+              <w:spacing w:after="60" w:line="245" w:lineRule="auto"/>
+            </w:pPr>
+            <w:r>
+              <w:rPr>
+                <w:sz w:val="17"/>
+              </w:rPr>
+              <w:t>Mục 2.1, bảng chân dung, dòng Kênh mua ưu tiên – cột A</w:t>
+            </w:r>
+          </w:p>
+        </w:tc>
+      </w:tr>
+      <w:tr>
+        <w:trPr>
+          <w:cantSplit/>
+        </w:trPr>
+        <w:tc>
+          <w:tcPr>
+            <w:tcW w:type="dxa" w:w="4592"/>
+            <w:shd w:fill="EFF5F4"/>
+          </w:tcPr>
+          <w:p>
+            <w:pPr>
+              <w:spacing w:after="60" w:line="245" w:lineRule="auto"/>
+            </w:pPr>
+            <w:r>
+              <w:rPr>
+                <w:sz w:val="17"/>
+              </w:rPr>
+              <w:t>Nhóm mua quà: ưu tiên cửa hàng/gian hàng trực tiếp</w:t>
+            </w:r>
+          </w:p>
+        </w:tc>
+        <w:tc>
+          <w:tcPr>
+            <w:tcW w:type="dxa" w:w="1247"/>
+            <w:shd w:fill="EFF5F4"/>
+          </w:tcPr>
+          <w:p>
+            <w:pPr>
+              <w:spacing w:after="60" w:line="245" w:lineRule="auto"/>
+            </w:pPr>
+            <w:r>
+              <w:rPr>
+                <w:sz w:val="17"/>
+              </w:rPr>
+              <w:t>4/14</w:t>
+            </w:r>
+          </w:p>
+        </w:tc>
+        <w:tc>
+          <w:tcPr>
+            <w:tcW w:type="dxa" w:w="1247"/>
+            <w:shd w:fill="EFF5F4"/>
+          </w:tcPr>
+          <w:p>
+            <w:pPr>
+              <w:spacing w:after="60" w:line="245" w:lineRule="auto"/>
+            </w:pPr>
+            <w:r>
+              <w:rPr>
+                <w:sz w:val="17"/>
+              </w:rPr>
+              <w:t>—</w:t>
+            </w:r>
+          </w:p>
+        </w:tc>
+        <w:tc>
+          <w:tcPr>
+            <w:tcW w:type="dxa" w:w="2948"/>
+            <w:shd w:fill="EFF5F4"/>
+          </w:tcPr>
+          <w:p>
+            <w:pPr>
+              <w:spacing w:after="60" w:line="245" w:lineRule="auto"/>
+            </w:pPr>
+            <w:r>
+              <w:rPr>
+                <w:sz w:val="17"/>
+              </w:rPr>
+              <w:t>Mục 2.1, bảng chân dung, dòng Kênh mua ưu tiên – cột A</w:t>
+            </w:r>
+          </w:p>
+        </w:tc>
+      </w:tr>
+      <w:tr>
+        <w:trPr>
+          <w:cantSplit/>
+        </w:trPr>
+        <w:tc>
+          <w:tcPr>
+            <w:tcW w:type="dxa" w:w="4592"/>
+          </w:tcPr>
+          <w:p>
+            <w:pPr>
+              <w:spacing w:after="60" w:line="245" w:lineRule="auto"/>
+            </w:pPr>
+            <w:r>
+              <w:rPr>
+                <w:sz w:val="17"/>
+              </w:rPr>
+              <w:t>Nhóm mua quà: ưu tiên TikTok Shop</w:t>
+            </w:r>
+          </w:p>
+        </w:tc>
+        <w:tc>
+          <w:tcPr>
+            <w:tcW w:type="dxa" w:w="1247"/>
+          </w:tcPr>
+          <w:p>
+            <w:pPr>
+              <w:spacing w:after="60" w:line="245" w:lineRule="auto"/>
+            </w:pPr>
+            <w:r>
+              <w:rPr>
+                <w:sz w:val="17"/>
+              </w:rPr>
+              <w:t>3/14</w:t>
+            </w:r>
+          </w:p>
+        </w:tc>
+        <w:tc>
+          <w:tcPr>
+            <w:tcW w:type="dxa" w:w="1247"/>
+          </w:tcPr>
+          <w:p>
+            <w:pPr>
+              <w:spacing w:after="60" w:line="245" w:lineRule="auto"/>
+            </w:pPr>
+            <w:r>
+              <w:rPr>
+                <w:sz w:val="17"/>
+              </w:rPr>
+              <w:t>—</w:t>
+            </w:r>
+          </w:p>
+        </w:tc>
+        <w:tc>
+          <w:tcPr>
+            <w:tcW w:type="dxa" w:w="2948"/>
+          </w:tcPr>
+          <w:p>
+            <w:pPr>
+              <w:spacing w:after="60" w:line="245" w:lineRule="auto"/>
+            </w:pPr>
+            <w:r>
+              <w:rPr>
+                <w:sz w:val="17"/>
+              </w:rPr>
+              <w:t>Mục 2.1, bảng chân dung, dòng Kênh mua ưu tiên – cột A</w:t>
+            </w:r>
+          </w:p>
+        </w:tc>
+      </w:tr>
+      <w:tr>
+        <w:trPr>
+          <w:cantSplit/>
+        </w:trPr>
+        <w:tc>
+          <w:tcPr>
+            <w:tcW w:type="dxa" w:w="4592"/>
+            <w:shd w:fill="EFF5F4"/>
+          </w:tcPr>
+          <w:p>
+            <w:pPr>
+              <w:spacing w:after="60" w:line="245" w:lineRule="auto"/>
+            </w:pPr>
+            <w:r>
+              <w:rPr>
+                <w:sz w:val="17"/>
+              </w:rPr>
+              <w:t>Nhóm đeo hằng ngày: ưu tiên cửa hàng/gian hàng trực tiếp</w:t>
+            </w:r>
+          </w:p>
+        </w:tc>
+        <w:tc>
+          <w:tcPr>
+            <w:tcW w:type="dxa" w:w="1247"/>
+            <w:shd w:fill="EFF5F4"/>
+          </w:tcPr>
+          <w:p>
+            <w:pPr>
+              <w:spacing w:after="60" w:line="245" w:lineRule="auto"/>
+            </w:pPr>
+            <w:r>
+              <w:rPr>
+                <w:sz w:val="17"/>
+              </w:rPr>
+              <w:t>7/12</w:t>
+            </w:r>
+          </w:p>
+        </w:tc>
+        <w:tc>
+          <w:tcPr>
+            <w:tcW w:type="dxa" w:w="1247"/>
+            <w:shd w:fill="EFF5F4"/>
+          </w:tcPr>
+          <w:p>
+            <w:pPr>
+              <w:spacing w:after="60" w:line="245" w:lineRule="auto"/>
+            </w:pPr>
+            <w:r>
+              <w:rPr>
+                <w:sz w:val="17"/>
+              </w:rPr>
+              <w:t>—</w:t>
+            </w:r>
+          </w:p>
+        </w:tc>
+        <w:tc>
+          <w:tcPr>
+            <w:tcW w:type="dxa" w:w="2948"/>
+            <w:shd w:fill="EFF5F4"/>
+          </w:tcPr>
+          <w:p>
+            <w:pPr>
+              <w:spacing w:after="60" w:line="245" w:lineRule="auto"/>
+            </w:pPr>
+            <w:r>
+              <w:rPr>
+                <w:sz w:val="17"/>
+              </w:rPr>
+              <w:t>Mục 2.1, bảng chân dung, dòng Kênh mua ưu tiên – cột B</w:t>
+            </w:r>
+          </w:p>
+        </w:tc>
+      </w:tr>
+      <w:tr>
+        <w:trPr>
+          <w:cantSplit/>
+        </w:trPr>
+        <w:tc>
+          <w:tcPr>
+            <w:tcW w:type="dxa" w:w="4592"/>
+          </w:tcPr>
+          <w:p>
+            <w:pPr>
+              <w:spacing w:after="60" w:line="245" w:lineRule="auto"/>
+            </w:pPr>
+            <w:r>
+              <w:rPr>
+                <w:sz w:val="17"/>
+              </w:rPr>
+              <w:t>Nhóm đeo hằng ngày: ưu tiên Shopee</w:t>
+            </w:r>
+          </w:p>
+        </w:tc>
+        <w:tc>
+          <w:tcPr>
+            <w:tcW w:type="dxa" w:w="1247"/>
+          </w:tcPr>
+          <w:p>
+            <w:pPr>
+              <w:spacing w:after="60" w:line="245" w:lineRule="auto"/>
+            </w:pPr>
+            <w:r>
+              <w:rPr>
+                <w:sz w:val="17"/>
+              </w:rPr>
+              <w:t>4/12</w:t>
+            </w:r>
+          </w:p>
+        </w:tc>
+        <w:tc>
+          <w:tcPr>
+            <w:tcW w:type="dxa" w:w="1247"/>
+          </w:tcPr>
+          <w:p>
+            <w:pPr>
+              <w:spacing w:after="60" w:line="245" w:lineRule="auto"/>
+            </w:pPr>
+            <w:r>
+              <w:rPr>
+                <w:sz w:val="17"/>
+              </w:rPr>
+              <w:t>—</w:t>
+            </w:r>
+          </w:p>
+        </w:tc>
+        <w:tc>
+          <w:tcPr>
+            <w:tcW w:type="dxa" w:w="2948"/>
+          </w:tcPr>
+          <w:p>
+            <w:pPr>
+              <w:spacing w:after="60" w:line="245" w:lineRule="auto"/>
+            </w:pPr>
+            <w:r>
+              <w:rPr>
+                <w:sz w:val="17"/>
+              </w:rPr>
+              <w:t>Mục 2.1, bảng chân dung, dòng Kênh mua ưu tiên – cột B</w:t>
+            </w:r>
+          </w:p>
+        </w:tc>
+      </w:tr>
+      <w:tr>
+        <w:trPr>
+          <w:cantSplit/>
+        </w:trPr>
+        <w:tc>
+          <w:tcPr>
+            <w:tcW w:type="dxa" w:w="4592"/>
+            <w:shd w:fill="EFF5F4"/>
+          </w:tcPr>
+          <w:p>
+            <w:pPr>
+              <w:spacing w:after="60" w:line="245" w:lineRule="auto"/>
+            </w:pPr>
+            <w:r>
+              <w:rPr>
+                <w:sz w:val="17"/>
+              </w:rPr>
+              <w:t>Nhóm đeo hằng ngày: ưu tiên Facebook/Instagram</w:t>
+            </w:r>
+          </w:p>
+        </w:tc>
+        <w:tc>
+          <w:tcPr>
+            <w:tcW w:type="dxa" w:w="1247"/>
+            <w:shd w:fill="EFF5F4"/>
+          </w:tcPr>
+          <w:p>
+            <w:pPr>
+              <w:spacing w:after="60" w:line="245" w:lineRule="auto"/>
+            </w:pPr>
+            <w:r>
+              <w:rPr>
+                <w:sz w:val="17"/>
+              </w:rPr>
+              <w:t>1/12</w:t>
+            </w:r>
+          </w:p>
+        </w:tc>
+        <w:tc>
+          <w:tcPr>
+            <w:tcW w:type="dxa" w:w="1247"/>
+            <w:shd w:fill="EFF5F4"/>
+          </w:tcPr>
+          <w:p>
+            <w:pPr>
+              <w:spacing w:after="60" w:line="245" w:lineRule="auto"/>
+            </w:pPr>
+            <w:r>
+              <w:rPr>
+                <w:sz w:val="17"/>
+              </w:rPr>
+              <w:t>—</w:t>
+            </w:r>
+          </w:p>
+        </w:tc>
+        <w:tc>
+          <w:tcPr>
+            <w:tcW w:type="dxa" w:w="2948"/>
+            <w:shd w:fill="EFF5F4"/>
+          </w:tcPr>
+          <w:p>
+            <w:pPr>
+              <w:spacing w:after="60" w:line="245" w:lineRule="auto"/>
+            </w:pPr>
+            <w:r>
+              <w:rPr>
+                <w:sz w:val="17"/>
+              </w:rPr>
+              <w:t>Mục 2.1, bảng chân dung, dòng Kênh mua ưu tiên – cột B</w:t>
+            </w:r>
+          </w:p>
+        </w:tc>
+      </w:tr>
+    </w:tbl>
+    <w:p>
+      <w:pPr>
+        <w:spacing w:after="20"/>
+      </w:pPr>
+    </w:p>
+    <w:p>
+      <w:r>
+        <w:t>Dấu “—” nghĩa là tài liệu không nêu tỷ lệ riêng ở dòng tương ứng, không phải tỷ lệ bằng 0. Nhóm mua quà: các kênh liệt kê là phần thông tin nguồn cung cấp; chưa có dữ liệu giải thích các lựa chọn không được liệt kê. Không tự tạo nhóm “khác” hoặc cộng số người giữa hai chân dung.</w:t>
+      </w:r>
+    </w:p>
+    <w:p>
+      <w:r>
+        <w:t>Thông tin ưu tiên kênh giúp thiết kế thử nghiệm; chưa thể khẳng định nơi khách đã mua, mở sẵn tài khoản bán hoặc mức phí nền tảng. Kênh tiếp cận/tư vấn và kênh giao dịch có thể khác nhau; cần ghi nhận riêng trong tuần 2.</w:t>
       </w:r>
     </w:p>
     <w:p>
@@ -2026,7 +3296,7 @@
               <w:rPr>
                 <w:sz w:val="17"/>
               </w:rPr>
-              <w:t>Pinky Shop – vòng tay handmade</w:t>
+              <w:t>Giá được tài liệu ghi dưới tên “Pinky Shop” – cần xác minh tên/URL</w:t>
             </w:r>
           </w:p>
         </w:tc>
@@ -2042,7 +3312,7 @@
               <w:rPr>
                 <w:sz w:val="17"/>
               </w:rPr>
-              <w:t>30.000đ/chiếc; 50.000đ/bộ 2 theo mô tả; ô giá 50.000đ cần làm rõ</w:t>
+              <w:t>30.000đ/chiếc; 50.000đ/bộ 2 là số trong báo cáo, chưa gắn chắc với trang/mẫu</w:t>
             </w:r>
           </w:p>
         </w:tc>
@@ -2058,9 +3328,9 @@
               <w:rPr>
                 <w:sz w:val="17"/>
               </w:rPr>
-              <w:t>Website người bán, theo ghi nhận của nhóm ngày 19/10/2026 [MC-02]</w:t>
+              <w:t>MC-00: bảng website đầu tài liệu dẫn quatanglambangtay.com; bảng đối thủ sau đó dẫn pinky.vn [MC-02]</w:t>
               <w:br/>
-              <w:t>Có thể tham khảo mức giá, cách trình bày và dịch vụ. Không mặc định giá/cấu hình còn hiệu lực.</w:t>
+              <w:t>Hai tên miền khác nhau, chưa biết cùng đơn vị hay giá ứng với URL nào. Ô giá 50.000đ và giá mô tả cũng cần đối chiếu. Không dùng để chốt giá bán của nhóm.</w:t>
             </w:r>
           </w:p>
         </w:tc>
@@ -2244,7 +3514,7 @@
     </w:p>
     <w:p>
       <w:r>
-        <w:t>Giá 20.000/28.000/22.000/30.000đ của V1/V3/V4/V5 trong BT1 là giá bán dự kiến, chưa phải giá khách đã trả. Tài liệu còn nêu shop tham khảo yêu cầu đơn sỉ đầu từ 500.000đ, trong khi trần tiền hàng theo BT1 là 333.333đ. Cần xác nhận giá đơn nhỏ/nguồn khác và mẫu cụ thể trước cam kết bán; không tự tăng lượng nhập để đạt ngưỡng sỉ.</w:t>
+        <w:t>Các giá V1/V3/V4/V5 lần lượt 20.000/28.000/22.000/30.000đ trong BT1 là dự kiến, chưa phải giá khách đã trả. Tài liệu nhóm dùng giới hạn tiền hàng 333.333đ và ghi shop yêu cầu đơn sỉ đầu từ 500.000đ; chưa có báo giá đơn nhỏ để giải quyết vướng mắc này. Cần xác nhận mẫu, điều kiện mua, phí và tổng chi trước khi cam kết bán. Không coi 333.333đ là quy định chung đã được đối chiếu đề gốc hoặc tăng lượng nhập chỉ để đạt giá sỉ.</w:t>
       </w:r>
     </w:p>
     <w:p>
@@ -2274,9 +3544,14 @@
       </w:r>
     </w:p>
     <w:p>
-      <w:r>
-        <w:t>Tệp nguyên bản đính kèm tại nguon/De_xuat_va_danh_gia_hai_y_tuong_kinh_doanh.docx</w:t>
-      </w:r>
+      <w:hyperlink r:id="rId11">
+        <w:r>
+          <w:rPr>
+            <w:color w:val="0563C1"/>
+          </w:rPr>
+          <w:t>Mở tệp đề xuất nguyên bản của nhóm</w:t>
+        </w:r>
+      </w:hyperlink>
     </w:p>
     <w:p>
       <w:pPr>
@@ -2292,7 +3567,7 @@
       </w:r>
     </w:p>
     <w:p>
-      <w:hyperlink r:id="rId11">
+      <w:hyperlink r:id="rId12">
         <w:r>
           <w:rPr>
             <w:color w:val="0563C1"/>
@@ -2306,21 +3581,31 @@
         <w:pStyle w:val="Heading2"/>
       </w:pPr>
       <w:r>
-        <w:t>MC-02 – Giá đối thủ Pinky Shop</w:t>
+        <w:t>MC-02 – Giá tham khảo gắn tên Pinky – chưa xác định URL tương ứng</w:t>
       </w:r>
     </w:p>
     <w:p>
       <w:r>
-        <w:t>Bảng đối thủ trong MC-00 ghi kiểm tra ngày 19/10/2026. Trích theo nhóm; chưa kiểm lại trang trực tuyến. Giá mô tả và ô giá chưa thống nhất, cần xác nhận cấu hình.</w:t>
+        <w:t>MC-00: bảng website ở phần 1.1 và bảng “Phương án 2: Vòng tay mẫu có sẵn”; thời điểm nhóm ghi là 19/10/2026. Bảng đầu dẫn quatanglambangtay.com; bảng sau dẫn https://www.pinky.vn/products/vong-tay-vong-tay-nam-vong-tay-doi-ca-tinh-cuc-dep-ma-vdtcnn1. Chưa xác minh cùng đơn vị hoặc giá thuộc trang nào. Giữ 30.000/50.000đ như số được báo cáo, chưa coi là giá đã kiểm tra.</w:t>
       </w:r>
     </w:p>
     <w:p>
-      <w:hyperlink r:id="rId12">
+      <w:hyperlink r:id="rId13">
         <w:r>
           <w:rPr>
             <w:color w:val="0563C1"/>
           </w:rPr>
           <w:t>Mở nguồn MC-02</w:t>
+        </w:r>
+      </w:hyperlink>
+    </w:p>
+    <w:p>
+      <w:hyperlink r:id="rId14">
+        <w:r>
+          <w:rPr>
+            <w:color w:val="0563C1"/>
+          </w:rPr>
+          <w:t>Đường dẫn thứ hai gắn tên Pinky trong tài liệu</w:t>
         </w:r>
       </w:hyperlink>
     </w:p>
@@ -2338,7 +3623,7 @@
       </w:r>
     </w:p>
     <w:p>
-      <w:hyperlink r:id="rId13">
+      <w:hyperlink r:id="rId15">
         <w:r>
           <w:rPr>
             <w:color w:val="0563C1"/>
@@ -2361,7 +3646,7 @@
       </w:r>
     </w:p>
     <w:p>
-      <w:hyperlink r:id="rId14">
+      <w:hyperlink r:id="rId16">
         <w:r>
           <w:rPr>
             <w:color w:val="0563C1"/>
@@ -2419,7 +3704,7 @@
     </w:p>
     <w:p>
       <w:r>
-        <w:t>Các nguồn trực tuyến chưa truy cập được trong phiên biên soạn. Số liệu khảo sát/giá được trích từ tệp nhóm gửi; không khẳng định đã mở và kiểm tra từng nguồn gốc.</w:t>
+        <w:t>Các số được trích từ tệp nhóm cung cấp. Bản rà soát ngày 20/10 không phải lượt thu thêm dữ liệu: mốc khảo sát và ngày tra cứu giá vẫn giữ theo nguồn 18–19/10/2026. Chưa có đối soát phản hồi gốc hoặc kiểm tra lại trang giá trực tuyến.</w:t>
       </w:r>
     </w:p>
     <w:sectPr>
@@ -2442,7 +3727,7 @@
       <w:jc w:val="right"/>
     </w:pPr>
     <w:r>
-      <w:t xml:space="preserve">Nguồn nhóm cung cấp • 19/10/2026 | </w:t>
+      <w:t xml:space="preserve">Nguồn nhóm cung cấp • 20/10/2026 | </w:t>
     </w:r>
     <w:fldSimple w:instr="PAGE"/>
   </w:p>

</xml_diff>

<commit_message>
docs: embed three evidence excerpts directly in BT2
</commit_message>
<xml_diff>
--- a/tai-lieu/cd-phong/tuan-1/bt2-vong-tay-mau-co-san/BT2_CD_PHONG_Co_hoi_kinh_doanh_vong_tay_mau_co_san.docx
+++ b/tai-lieu/cd-phong/tuan-1/bt2-vong-tay-mau-co-san/BT2_CD_PHONG_Co_hoi_kinh_doanh_vong_tay_mau_co_san.docx
@@ -14,7 +14,7 @@
     </w:p>
     <w:p>
       <w:r>
-        <w:t>Người biên soạn: Phong – Communication &amp; Documentation Lead | 20/10/2026</w:t>
+        <w:t>Người biên soạn: Phong – Communication &amp; Documentation Lead | 21/10/2026</w:t>
       </w:r>
     </w:p>
     <w:p>
@@ -58,6 +58,11 @@
     <w:p>
       <w:r>
         <w:t>Độ dài phần mô tả: 270 từ theo khoảng trắng. Nguồn: MC-00, MC-01. Đây là phần 200–300 từ theo yêu cầu; các mục còn lại là phân tích và phụ lục.</w:t>
+      </w:r>
+    </w:p>
+    <w:p>
+      <w:r>
+        <w:t>Ảnh đối chiếu tại phụ lục A3: Hình MC-01a về nhu cầu, Hình MC-01b về tiêu chí, Hình MC-01c về chân dung. Chú thích và ảnh không thuộc phần đếm 200–300 từ.</w:t>
       </w:r>
     </w:p>
     <w:p>
@@ -428,6 +433,11 @@
     <w:p>
       <w:r>
         <w:t>Hai nhóm mục đích mua là cách mô tả theo tài liệu khảo sát, không mặc định là hai nhóm loại trừ nhau. Chưa biết địa bàn từng người trả lời hoặc cơ chế tuyển mẫu; định hướng TP.HCM dựa trên địa bàn hoạt động của nhóm.</w:t>
+      </w:r>
+    </w:p>
+    <w:p>
+      <w:r>
+        <w:t>Xem Hình MC-01c tại phụ lục A3 để đối chiếu với bảng chân dung trong báo cáo nhóm.</w:t>
       </w:r>
     </w:p>
     <w:p>
@@ -3202,6 +3212,223 @@
         <w:pStyle w:val="Heading2"/>
       </w:pPr>
       <w:r>
+        <w:t>A3. Ảnh trích từ báo cáo nhóm</w:t>
+      </w:r>
+    </w:p>
+    <w:p>
+      <w:r>
+        <w:t>Các ảnh giữ nguyên phần nội dung của tệp nhóm. Đây là ảnh báo cáo tổng hợp, chưa phải ảnh phản hồi khảo sát hoặc website gốc.</w:t>
+      </w:r>
+    </w:p>
+    <w:p>
+      <w:pPr>
+        <w:pStyle w:val="Heading2"/>
+      </w:pPr>
+      <w:r>
+        <w:t>Hình MC-01a. Nhu cầu và sở thích trong báo cáo nhóm</w:t>
+      </w:r>
+    </w:p>
+    <w:p>
+      <w:pPr>
+        <w:keepNext/>
+        <w:spacing w:before="0" w:after="60"/>
+        <w:jc w:val="center"/>
+      </w:pPr>
+      <w:r>
+        <w:drawing>
+          <wp:inline xmlns:a="http://schemas.openxmlformats.org/drawingml/2006/main" xmlns:pic="http://schemas.openxmlformats.org/drawingml/2006/picture">
+            <wp:extent cx="5832000" cy="7223839"/>
+            <wp:docPr id="1" name="Picture 1" title="Hình MC-01a: Nhu cầu và sở thích trong báo cáo nhóm" descr="Nguồn: tệp đề xuất nhóm, mục 1.1, trang 1 bản PDF nguồn. Ảnh giữ nguyên phần báo cáo nêu 28 phản hồi ngày 18–19/10/2026 và bảng nhu cầu. Đây là bản tổng hợp, chưa phải ảnh phản hồi khảo sát gốc."/>
+            <wp:cNvGraphicFramePr>
+              <a:graphicFrameLocks noChangeAspect="1"/>
+            </wp:cNvGraphicFramePr>
+            <a:graphic>
+              <a:graphicData uri="http://schemas.openxmlformats.org/drawingml/2006/picture">
+                <pic:pic>
+                  <pic:nvPicPr>
+                    <pic:cNvPr id="0" name="MC01_01_TRICH_BAO_CAO_NHU_CAU.png"/>
+                    <pic:cNvPicPr/>
+                  </pic:nvPicPr>
+                  <pic:blipFill>
+                    <a:blip r:embed="rId11"/>
+                    <a:stretch>
+                      <a:fillRect/>
+                    </a:stretch>
+                  </pic:blipFill>
+                  <pic:spPr>
+                    <a:xfrm>
+                      <a:off x="0" y="0"/>
+                      <a:ext cx="5832000" cy="7223839"/>
+                    </a:xfrm>
+                    <a:prstGeom prst="rect"/>
+                  </pic:spPr>
+                </pic:pic>
+              </a:graphicData>
+            </a:graphic>
+          </wp:inline>
+        </w:drawing>
+      </w:r>
+    </w:p>
+    <w:p>
+      <w:pPr>
+        <w:pStyle w:val="Caption"/>
+        <w:keepNext w:val="0"/>
+        <w:keepLines/>
+        <w:spacing w:after="60"/>
+      </w:pPr>
+      <w:r>
+        <w:rPr>
+          <w:sz w:val="18"/>
+        </w:rPr>
+        <w:t>Nguồn: tệp đề xuất nhóm, mục 1.1, trang 1 bản PDF nguồn. Ảnh giữ nguyên phần báo cáo nêu 28 phản hồi ngày 18–19/10/2026 và bảng nhu cầu. Đây là bản tổng hợp, chưa phải ảnh phản hồi khảo sát gốc.</w:t>
+      </w:r>
+    </w:p>
+    <w:p>
+      <w:r>
+        <w:br w:type="page"/>
+      </w:r>
+    </w:p>
+    <w:p>
+      <w:pPr>
+        <w:pStyle w:val="Heading2"/>
+      </w:pPr>
+      <w:r>
+        <w:t>Hình MC-01b. Tổng hợp tiêu chí chất liệu, giá và độ bền</w:t>
+      </w:r>
+    </w:p>
+    <w:p>
+      <w:pPr>
+        <w:keepNext/>
+        <w:spacing w:before="0" w:after="60"/>
+        <w:jc w:val="center"/>
+      </w:pPr>
+      <w:r>
+        <w:drawing>
+          <wp:inline xmlns:a="http://schemas.openxmlformats.org/drawingml/2006/main" xmlns:pic="http://schemas.openxmlformats.org/drawingml/2006/picture">
+            <wp:extent cx="5832000" cy="2960108"/>
+            <wp:docPr id="2" name="Picture 2" title="Hình MC-01b: Tổng hợp tiêu chí chất liệu, giá và độ bền" descr="Nguồn: tệp đề xuất nhóm, trang 2 bản PDF nguồn, đoạn đánh giá sau mục 1.1. Đoạn này còn nêu phương án tùy chọn charm/chữ cái ở giai đoạn sơ bộ; dùng ảnh để dẫn số liệu, không thay quyết định cuối BT1 chọn vòng tay mẫu có sẵn."/>
+            <wp:cNvGraphicFramePr>
+              <a:graphicFrameLocks noChangeAspect="1"/>
+            </wp:cNvGraphicFramePr>
+            <a:graphic>
+              <a:graphicData uri="http://schemas.openxmlformats.org/drawingml/2006/picture">
+                <pic:pic>
+                  <pic:nvPicPr>
+                    <pic:cNvPr id="0" name="MC01_02_TRICH_BAO_CAO_TIEU_CHI.png"/>
+                    <pic:cNvPicPr/>
+                  </pic:nvPicPr>
+                  <pic:blipFill>
+                    <a:blip r:embed="rId12"/>
+                    <a:stretch>
+                      <a:fillRect/>
+                    </a:stretch>
+                  </pic:blipFill>
+                  <pic:spPr>
+                    <a:xfrm>
+                      <a:off x="0" y="0"/>
+                      <a:ext cx="5832000" cy="2960108"/>
+                    </a:xfrm>
+                    <a:prstGeom prst="rect"/>
+                  </pic:spPr>
+                </pic:pic>
+              </a:graphicData>
+            </a:graphic>
+          </wp:inline>
+        </w:drawing>
+      </w:r>
+    </w:p>
+    <w:p>
+      <w:pPr>
+        <w:pStyle w:val="Caption"/>
+        <w:keepNext w:val="0"/>
+        <w:keepLines/>
+        <w:spacing w:after="60"/>
+      </w:pPr>
+      <w:r>
+        <w:rPr>
+          <w:sz w:val="18"/>
+        </w:rPr>
+        <w:t>Nguồn: tệp đề xuất nhóm, trang 2 bản PDF nguồn, đoạn đánh giá sau mục 1.1. Đoạn này còn nêu phương án tùy chọn charm/chữ cái ở giai đoạn sơ bộ; dùng ảnh để dẫn số liệu, không thay quyết định cuối BT1 chọn vòng tay mẫu có sẵn.</w:t>
+      </w:r>
+    </w:p>
+    <w:p>
+      <w:r>
+        <w:br w:type="page"/>
+      </w:r>
+    </w:p>
+    <w:p>
+      <w:pPr>
+        <w:pStyle w:val="Heading2"/>
+      </w:pPr>
+      <w:r>
+        <w:t>Hình MC-01c. Thông tin mẫu và hai chân dung khách hàng</w:t>
+      </w:r>
+    </w:p>
+    <w:p>
+      <w:pPr>
+        <w:keepNext/>
+        <w:spacing w:before="0" w:after="60"/>
+        <w:jc w:val="center"/>
+      </w:pPr>
+      <w:r>
+        <w:drawing>
+          <wp:inline xmlns:a="http://schemas.openxmlformats.org/drawingml/2006/main" xmlns:pic="http://schemas.openxmlformats.org/drawingml/2006/picture">
+            <wp:extent cx="5832000" cy="7282649"/>
+            <wp:docPr id="3" name="Picture 3" title="Hình MC-01c: Thông tin mẫu và hai chân dung khách hàng" descr="Nguồn: tệp đề xuất nhóm, mục 2.1, trang 2 bản PDF nguồn. Kênh ưu tiên, mức chi trả tự khai và ý định mua trong ảnh chưa phải giao dịch. Số liệu được giữ theo báo cáo, chưa đối soát phản hồi gốc."/>
+            <wp:cNvGraphicFramePr>
+              <a:graphicFrameLocks noChangeAspect="1"/>
+            </wp:cNvGraphicFramePr>
+            <a:graphic>
+              <a:graphicData uri="http://schemas.openxmlformats.org/drawingml/2006/picture">
+                <pic:pic>
+                  <pic:nvPicPr>
+                    <pic:cNvPr id="0" name="MC01_03_TRICH_BAO_CAO_CHAN_DUNG.png"/>
+                    <pic:cNvPicPr/>
+                  </pic:nvPicPr>
+                  <pic:blipFill>
+                    <a:blip r:embed="rId13"/>
+                    <a:stretch>
+                      <a:fillRect/>
+                    </a:stretch>
+                  </pic:blipFill>
+                  <pic:spPr>
+                    <a:xfrm>
+                      <a:off x="0" y="0"/>
+                      <a:ext cx="5832000" cy="7282649"/>
+                    </a:xfrm>
+                    <a:prstGeom prst="rect"/>
+                  </pic:spPr>
+                </pic:pic>
+              </a:graphicData>
+            </a:graphic>
+          </wp:inline>
+        </w:drawing>
+      </w:r>
+    </w:p>
+    <w:p>
+      <w:pPr>
+        <w:pStyle w:val="Caption"/>
+        <w:keepNext w:val="0"/>
+        <w:keepLines/>
+        <w:spacing w:after="60"/>
+      </w:pPr>
+      <w:r>
+        <w:rPr>
+          <w:sz w:val="18"/>
+        </w:rPr>
+        <w:t>Nguồn: tệp đề xuất nhóm, mục 2.1, trang 2 bản PDF nguồn. Kênh ưu tiên, mức chi trả tự khai và ý định mua trong ảnh chưa phải giao dịch. Số liệu được giữ theo báo cáo, chưa đối soát phản hồi gốc.</w:t>
+      </w:r>
+    </w:p>
+    <w:p>
+      <w:r>
+        <w:br w:type="page"/>
+      </w:r>
+    </w:p>
+    <w:p>
+      <w:pPr>
+        <w:pStyle w:val="Heading2"/>
+      </w:pPr>
+      <w:r>
         <w:t>B. Giá và nơi bán sản phẩm tương tự</w:t>
       </w:r>
     </w:p>
@@ -3544,7 +3771,7 @@
       </w:r>
     </w:p>
     <w:p>
-      <w:hyperlink r:id="rId11">
+      <w:hyperlink r:id="rId14">
         <w:r>
           <w:rPr>
             <w:color w:val="0563C1"/>
@@ -3567,7 +3794,7 @@
       </w:r>
     </w:p>
     <w:p>
-      <w:hyperlink r:id="rId12">
+      <w:hyperlink r:id="rId15">
         <w:r>
           <w:rPr>
             <w:color w:val="0563C1"/>
@@ -3590,7 +3817,7 @@
       </w:r>
     </w:p>
     <w:p>
-      <w:hyperlink r:id="rId13">
+      <w:hyperlink r:id="rId16">
         <w:r>
           <w:rPr>
             <w:color w:val="0563C1"/>
@@ -3600,7 +3827,7 @@
       </w:hyperlink>
     </w:p>
     <w:p>
-      <w:hyperlink r:id="rId14">
+      <w:hyperlink r:id="rId17">
         <w:r>
           <w:rPr>
             <w:color w:val="0563C1"/>
@@ -3623,7 +3850,7 @@
       </w:r>
     </w:p>
     <w:p>
-      <w:hyperlink r:id="rId15">
+      <w:hyperlink r:id="rId18">
         <w:r>
           <w:rPr>
             <w:color w:val="0563C1"/>
@@ -3646,7 +3873,7 @@
       </w:r>
     </w:p>
     <w:p>
-      <w:hyperlink r:id="rId16">
+      <w:hyperlink r:id="rId19">
         <w:r>
           <w:rPr>
             <w:color w:val="0563C1"/>
@@ -3704,7 +3931,7 @@
     </w:p>
     <w:p>
       <w:r>
-        <w:t>Các số được trích từ tệp nhóm cung cấp. Bản rà soát ngày 20/10 không phải lượt thu thêm dữ liệu: mốc khảo sát và ngày tra cứu giá vẫn giữ theo nguồn 18–19/10/2026. Chưa có đối soát phản hồi gốc hoặc kiểm tra lại trang giá trực tuyến.</w:t>
+        <w:t>Các số được trích từ tệp nhóm cung cấp. Bản bổ sung ảnh ngày 21/10 không phải lượt thu thêm dữ liệu: mốc khảo sát và ngày tra cứu giá vẫn giữ theo nguồn 18–19/10/2026. Chưa có đối soát phản hồi gốc hoặc kiểm tra lại trang giá trực tuyến.</w:t>
       </w:r>
     </w:p>
     <w:sectPr>
@@ -3727,7 +3954,7 @@
       <w:jc w:val="right"/>
     </w:pPr>
     <w:r>
-      <w:t xml:space="preserve">Nguồn nhóm cung cấp • 20/10/2026 | </w:t>
+      <w:t xml:space="preserve">Nguồn nhóm cung cấp • 21/10/2026 | </w:t>
     </w:r>
     <w:fldSimple w:instr="PAGE"/>
   </w:p>
@@ -4908,9 +5135,11 @@
       <w:spacing w:line="240" w:lineRule="auto"/>
     </w:pPr>
     <w:rPr>
-      <w:b/>
+      <w:rFonts w:ascii="DejaVu Sans" w:hAnsi="DejaVu Sans"/>
+      <w:b w:val="0"/>
       <w:bCs/>
-      <w:color w:val="4F81BD" w:themeColor="accent1"/>
+      <w:i/>
+      <w:color w:val="4B5563"/>
       <w:sz w:val="18"/>
       <w:szCs w:val="18"/>
     </w:rPr>

</xml_diff>